<commit_message>
add handle transient Nominatim failure
</commit_message>
<xml_diff>
--- a/Readme.md.docx
+++ b/Readme.md.docx
@@ -35,22 +35,7 @@
       </w:r>
       <w:proofErr w:type="spellEnd"/>
       <w:r>
-        <w:t xml:space="preserve">’ folder contains the main API Post function, and ‘test’ folder contains unit tests of the API POST. </w:t>
-      </w:r>
-      <w:r>
-        <w:t>The</w:t>
-      </w:r>
-      <w:r>
-        <w:t>se</w:t>
-      </w:r>
-      <w:r>
-        <w:t xml:space="preserve"> test cases are not mocking </w:t>
-      </w:r>
-      <w:r>
-        <w:t>tests; they</w:t>
-      </w:r>
-      <w:r>
-        <w:t xml:space="preserve"> run through both </w:t>
+        <w:t xml:space="preserve">’ folder contains the main API Post function, and ‘test’ folder contains unit tests of the API POST. These test cases are not mocking tests; they run through both </w:t>
       </w:r>
       <w:proofErr w:type="spellStart"/>
       <w:r>
@@ -72,13 +57,7 @@
       </w:r>
       <w:proofErr w:type="spellEnd"/>
       <w:r>
-        <w:t xml:space="preserve"> API call. I do not create all the test cases</w:t>
-      </w:r>
-      <w:r>
-        <w:t xml:space="preserve"> cover all scenarios</w:t>
-      </w:r>
-      <w:r>
-        <w:t>, just prove of concept.</w:t>
+        <w:t xml:space="preserve"> API call. I do not create all the test cases cover all scenarios, just prove of concept.</w:t>
       </w:r>
     </w:p>
     <w:p/>
@@ -140,14 +119,36 @@
           <w:rPr>
             <w:rStyle w:val="Hyperlink"/>
           </w:rPr>
-          <w:t>william_zwd@outlook.com</w:t>
+          <w:t>william_zwd@outlook.com)</w:t>
         </w:r>
       </w:hyperlink>
       <w:r>
-        <w:t>)</w:t>
-      </w:r>
-      <w:r>
         <w:t>”.</w:t>
+      </w:r>
+      <w:r>
+        <w:t xml:space="preserve"> “</w:t>
+      </w:r>
+      <w:proofErr w:type="spellStart"/>
+      <w:r>
+        <w:t>PosiTrace</w:t>
+      </w:r>
+      <w:proofErr w:type="spellEnd"/>
+      <w:r>
+        <w:t xml:space="preserve">” handles </w:t>
+      </w:r>
+      <w:r>
+        <w:t xml:space="preserve">transient </w:t>
+      </w:r>
+      <w:proofErr w:type="spellStart"/>
+      <w:r>
+        <w:t>Nominatim</w:t>
+      </w:r>
+      <w:proofErr w:type="spellEnd"/>
+      <w:r>
+        <w:t xml:space="preserve"> failures</w:t>
+      </w:r>
+      <w:r>
+        <w:t xml:space="preserve"> by setting max retry to 3.</w:t>
       </w:r>
     </w:p>
     <w:p/>

</xml_diff>